<commit_message>
Nivel avansat: laborator de model PD, percentile pe sector, laborator de anomalii
</commit_message>
<xml_diff>
--- a/Speaking_notes_Laborator_de_model.docx
+++ b/Speaking_notes_Laborator_de_model.docx
@@ -1650,7 +1650,7 @@
           <w:sz w:val="21"/>
           <w:szCs w:val="21"/>
         </w:rPr>
-        <w:t xml:space="preserve">. Derulează încet prin cele douăsprezece rânduri.</w:t>
+        <w:t xml:space="preserve">, al doilea de pe pagină. Derulează încet prin cele douăsprezece rânduri. Formula fiecărei variabile apare și sub caseta ei din pasul 2, deci participanții o au la îndemână și când bifează.</w:t>
       </w:r>
     </w:p>
     <w:p>
@@ -4000,7 +4000,7 @@
           <w:sz w:val="21"/>
           <w:szCs w:val="21"/>
         </w:rPr>
-        <w:t xml:space="preserve">„Asta e concluzia zilei, și e una liniștitoare și neliniștitoare în același timp. Liniștitoare: judecata voastră de analist, codificată într-un scorecard simplu, prinde ce prinde și un model statistic. Neliniștitoare: niciunul dintre cele trei nu vă ajută în mijloc, acolo unde stau dosarele grele. Modelele rezolvă extremele. Mijlocul rămâne al vostru — și pentru mijloc aveți nevoie de ce vine în blocurile următoare: unde stă clientul în distribuția lui și ce ascunde felul în care raportează.”</w:t>
+        <w:t xml:space="preserve">„Asta e concluzia zilei, și e una liniștitoare și neliniștitoare în același timp. Liniștitoare: judecata voastră de analist, codificată într-un scorecard simplu, prinde ce prinde și un model statistic. Neliniștitoare: niciunul dintre cele trei nu vă ajută în mijloc, acolo unde stau dosarele grele. Modelele rezolvă extremele. Mijlocul rămâne al vostru — și pentru mijloc aveți nevoie de ce vine în blocurile următoare: unde stă clientul în distribuția sectorului lui și ce arată verificările de plauzibilitate și profilele atipice.”</w:t>
       </w:r>
     </w:p>
     <w:p>

</xml_diff>

<commit_message>
Lentila 2: corelatii si anomalii (praguri, z-score si IQR, reziduuri pe relatii, scor 0-100)
</commit_message>
<xml_diff>
--- a/Speaking_notes_Laborator_de_model.docx
+++ b/Speaking_notes_Laborator_de_model.docx
@@ -4000,7 +4000,7 @@
           <w:sz w:val="21"/>
           <w:szCs w:val="21"/>
         </w:rPr>
-        <w:t xml:space="preserve">„Asta e concluzia zilei, și e una liniștitoare și neliniștitoare în același timp. Liniștitoare: judecata voastră de analist, codificată într-un scorecard simplu, prinde ce prinde și un model statistic. Neliniștitoare: niciunul dintre cele trei nu vă ajută în mijloc, acolo unde stau dosarele grele. Modelele rezolvă extremele. Mijlocul rămâne al vostru — și pentru mijloc aveți nevoie de ce vine în blocurile următoare: unde stă clientul în distribuția sectorului lui și ce arată verificările de plauzibilitate și profilele atipice.”</w:t>
+        <w:t xml:space="preserve">„Asta e concluzia zilei, și e una liniștitoare și neliniștitoare în același timp. Liniștitoare: judecata voastră de analist, codificată într-un scorecard simplu, prinde ce prinde și un model statistic. Neliniștitoare: niciunul dintre cele trei nu vă ajută în mijloc, acolo unde stau dosarele grele. Modelele rezolvă extremele. Mijlocul rămâne al vostru — și pentru mijloc aveți nevoie de ce vine în blocurile următoare: unde stă clientul în distribuția sectorului lui și ce arată verificările de plauzibilitate, corelațiile sectorului și cele trei niveluri de detecție a anomaliilor.”</w:t>
       </w:r>
     </w:p>
     <w:p>
@@ -5810,7 +5810,7 @@
         <w:sz w:val="16"/>
         <w:szCs w:val="16"/>
       </w:rPr>
-      <w:t xml:space="preserve">Speaking notes · Laboratorul de model · Nivel avansat · pagina </w:t>
+      <w:t xml:space="preserve">Laboratorul de model · speaking notes</w:t>
     </w:r>
     <w:r>
       <w:rPr>

</xml_diff>